<commit_message>
docs(workshop): 補拍 H01/M08/P04 三張小漏塞回素材 + demo dry-run v2.11.26 三雷驗證全過
A1：3 張小漏塞回工作坊素材
- H01 章節導引示意 → hands-on docx 目錄頁
- M08 Chrome 安裝圖示 → 操作手冊 陸-(二)
- P04 新專案 form → PPT slide 19
- 寫 4 個 _*.py 腳本（inspect / embed / retry / export PDF）
- 重匯 3 PDF（COM Automation 共用 instance + RPC busy retry）
- 留 4 個 .bak 備份檔（工作坊現場萬一塞圖有問題秒回滾）

A2：Demo project dry-run（DEMO-2026-001 示範林班 2026）
- 建專案 + 2 樣區（矩 20×25 + 圓 0.05 ha）+ 7+1 立木（含 AI 辨識）
- v2.11.26 三雷驗證全過：modal z-index / dedup / synthetic event
- Steps 5-7（QAQC + AI 收尾驗）跳過（不在工作坊範圍 / 與三雷驗證重複）

工作坊 ship-ready，倒數 ~3-4 天，A3 全程走場留 5/13。

Co-Authored-By: Claude Opus 4.7 (1M context) <noreply@anthropic.com>
</commit_message>
<xml_diff>
--- a/reports/2026-05-mid-demo/03-現場練習指南-下午hands-on.docx
+++ b/reports/2026-05-mid-demo/03-現場練習指南-下午hands-on.docx
@@ -491,29 +491,42 @@
         </w:numPr>
         <w:spacing w:before="40" w:after="40" w:line="300" w:lineRule="auto"/>
       </w:pPr>
-      <w:r>
-        <w:rPr>
-          <w:rFonts w:eastAsia="標楷體"/>
-          <w:b/>
-          <w:bCs/>
-          <w:color w:val="C00000"/>
-        </w:rPr>
-        <w:t xml:space="preserve">[此處插入 screenshot H01：（章節導引示意，可截 hands-on 目錄頁）] </w:t>
-      </w:r>
-      <w:r>
-        <w:rPr>
-          <w:rFonts w:eastAsia="標楷體"/>
-        </w:rPr>
-        <w:t>講師事後</w:t>
-      </w:r>
       <w:proofErr w:type="gramStart"/>
-      <w:r>
-        <w:rPr>
-          <w:rFonts w:eastAsia="標楷體"/>
-        </w:rPr>
-        <w:t>手動補圖位置</w:t>
-      </w:r>
       <w:proofErr w:type="gramEnd"/>
+      <w:r>
+        <w:drawing>
+          <wp:inline xmlns:a="http://schemas.openxmlformats.org/drawingml/2006/main" xmlns:pic="http://schemas.openxmlformats.org/drawingml/2006/picture">
+            <wp:extent cx="5040000" cy="5249999"/>
+            <wp:docPr id="14" name="Picture 14"/>
+            <wp:cNvGraphicFramePr>
+              <a:graphicFrameLocks noChangeAspect="1"/>
+            </wp:cNvGraphicFramePr>
+            <a:graphic>
+              <a:graphicData uri="http://schemas.openxmlformats.org/drawingml/2006/picture">
+                <pic:pic>
+                  <pic:nvPicPr>
+                    <pic:cNvPr id="0" name="H01-章節導引示意.png"/>
+                    <pic:cNvPicPr/>
+                  </pic:nvPicPr>
+                  <pic:blipFill>
+                    <a:blip r:embed="rId24"/>
+                    <a:stretch>
+                      <a:fillRect/>
+                    </a:stretch>
+                  </pic:blipFill>
+                  <pic:spPr>
+                    <a:xfrm>
+                      <a:off x="0" y="0"/>
+                      <a:ext cx="5040000" cy="5249999"/>
+                    </a:xfrm>
+                    <a:prstGeom prst="rect"/>
+                  </pic:spPr>
+                </pic:pic>
+              </a:graphicData>
+            </a:graphic>
+          </wp:inline>
+        </w:drawing>
+      </w:r>
     </w:p>
     <w:p>
       <w:pPr>

</xml_diff>